<commit_message>
fin de inf. mensual
</commit_message>
<xml_diff>
--- a/templates_word/INF. MENSUAL PLANTILLA.docx
+++ b/templates_word/INF. MENSUAL PLANTILLA.docx
@@ -554,8 +554,18 @@
           <w:color w:val="000000" w:themeColor="text1"/>
           <w:sz w:val="18"/>
         </w:rPr>
-        <w:t>REF       :</w:t>
-      </w:r>
+        <w:t xml:space="preserve">REF     </w:t>
+      </w:r>
+      <w:proofErr w:type="gramStart"/>
+      <w:r>
+        <w:rPr>
+          <w:b/>
+          <w:color w:val="000000" w:themeColor="text1"/>
+          <w:sz w:val="18"/>
+        </w:rPr>
+        <w:t xml:space="preserve">  :</w:t>
+      </w:r>
+      <w:proofErr w:type="gramEnd"/>
       <w:r>
         <w:rPr>
           <w:b/>
@@ -1306,7 +1316,7 @@
           <w:sz w:val="20"/>
           <w:szCs w:val="20"/>
         </w:rPr>
-        <w:t xml:space="preserve">, por el cual se asigna Trabajo Comunitario a la beneficiaria </w:t>
+        <w:t>, por el cual se asigna Trabajo Comunitario a</w:t>
       </w:r>
       <w:r>
         <w:rPr>
@@ -1314,6 +1324,38 @@
           <w:sz w:val="20"/>
           <w:szCs w:val="20"/>
         </w:rPr>
+        <w:t>l</w:t>
+      </w:r>
+      <w:r>
+        <w:rPr>
+          <w:rFonts w:eastAsia="MS Mincho" w:cstheme="minorHAnsi"/>
+          <w:sz w:val="20"/>
+          <w:szCs w:val="20"/>
+        </w:rPr>
+        <w:t xml:space="preserve"> beneficiari</w:t>
+      </w:r>
+      <w:r>
+        <w:rPr>
+          <w:rFonts w:eastAsia="MS Mincho" w:cstheme="minorHAnsi"/>
+          <w:sz w:val="20"/>
+          <w:szCs w:val="20"/>
+        </w:rPr>
+        <w:t>o(a)</w:t>
+      </w:r>
+      <w:r>
+        <w:rPr>
+          <w:rFonts w:eastAsia="MS Mincho" w:cstheme="minorHAnsi"/>
+          <w:sz w:val="20"/>
+          <w:szCs w:val="20"/>
+        </w:rPr>
+        <w:t xml:space="preserve"> </w:t>
+      </w:r>
+      <w:r>
+        <w:rPr>
+          <w:rFonts w:eastAsia="MS Mincho" w:cstheme="minorHAnsi"/>
+          <w:sz w:val="20"/>
+          <w:szCs w:val="20"/>
+        </w:rPr>
         <w:t>{{nombre</w:t>
       </w:r>
       <w:r>
@@ -1322,6 +1364,14 @@
           <w:sz w:val="20"/>
           <w:szCs w:val="20"/>
         </w:rPr>
+        <w:t>_mayus</w:t>
+      </w:r>
+      <w:r>
+        <w:rPr>
+          <w:rFonts w:eastAsia="MS Mincho" w:cstheme="minorHAnsi"/>
+          <w:sz w:val="20"/>
+          <w:szCs w:val="20"/>
+        </w:rPr>
         <w:t>}}</w:t>
       </w:r>
       <w:r>
@@ -1408,7 +1458,7 @@
           <w:sz w:val="20"/>
           <w:szCs w:val="20"/>
         </w:rPr>
-        <w:t xml:space="preserve"> de </w:t>
+        <w:t xml:space="preserve"> de</w:t>
       </w:r>
       <w:r>
         <w:rPr>
@@ -1418,7 +1468,7 @@
           <w:sz w:val="20"/>
           <w:szCs w:val="20"/>
         </w:rPr>
-        <w:t xml:space="preserve">un </w:t>
+        <w:t xml:space="preserve"> </w:t>
       </w:r>
       <w:r>
         <w:rPr>
@@ -1486,43 +1536,7 @@
           <w:sz w:val="20"/>
           <w:szCs w:val="20"/>
         </w:rPr>
-        <w:t>(</w:t>
-      </w:r>
-      <w:r>
-        <w:rPr>
-          <w:b/>
-          <w:color w:val="000000" w:themeColor="text1"/>
-          <w:sz w:val="20"/>
-          <w:szCs w:val="20"/>
-        </w:rPr>
-        <w:t xml:space="preserve"> </w:t>
-      </w:r>
-      <w:r>
-        <w:rPr>
-          <w:b/>
-          <w:color w:val="000000" w:themeColor="text1"/>
-          <w:sz w:val="20"/>
-          <w:szCs w:val="20"/>
-        </w:rPr>
-        <w:t>{{carga}}</w:t>
-      </w:r>
-      <w:r>
-        <w:rPr>
-          <w:b/>
-          <w:color w:val="000000" w:themeColor="text1"/>
-          <w:sz w:val="20"/>
-          <w:szCs w:val="20"/>
-        </w:rPr>
-        <w:t xml:space="preserve"> </w:t>
-      </w:r>
-      <w:r>
-        <w:rPr>
-          <w:b/>
-          <w:color w:val="000000" w:themeColor="text1"/>
-          <w:sz w:val="20"/>
-          <w:szCs w:val="20"/>
-        </w:rPr>
-        <w:t>)</w:t>
+        <w:t>({{carga}})</w:t>
       </w:r>
       <w:r>
         <w:rPr>
@@ -1636,16 +1650,41 @@
           <w:sz w:val="20"/>
           <w:szCs w:val="20"/>
         </w:rPr>
-        <w:t xml:space="preserve">, emitida por el Juzgado de Ejecución Penal 1° de El Alto, que disponen: Trabajo Comunitario, a favor del GAMEA, por el periodo un </w:t>
-      </w:r>
-      <w:r>
-        <w:rPr>
-          <w:b/>
-          <w:color w:val="000000" w:themeColor="text1"/>
-          <w:sz w:val="20"/>
-          <w:szCs w:val="20"/>
-        </w:rPr>
-        <w:t>( {{</w:t>
+        <w:t xml:space="preserve">, emitida </w:t>
+      </w:r>
+      <w:r>
+        <w:rPr>
+          <w:color w:val="000000" w:themeColor="text1"/>
+          <w:sz w:val="20"/>
+          <w:szCs w:val="20"/>
+        </w:rPr>
+        <w:lastRenderedPageBreak/>
+        <w:t xml:space="preserve">por el Juzgado de Ejecución Penal 1° de El Alto, que disponen: Trabajo Comunitario, a favor del GAMEA, por el periodo </w:t>
+      </w:r>
+      <w:r>
+        <w:rPr>
+          <w:color w:val="000000" w:themeColor="text1"/>
+          <w:sz w:val="20"/>
+          <w:szCs w:val="20"/>
+        </w:rPr>
+        <w:t>de</w:t>
+      </w:r>
+      <w:r>
+        <w:rPr>
+          <w:color w:val="000000" w:themeColor="text1"/>
+          <w:sz w:val="20"/>
+          <w:szCs w:val="20"/>
+        </w:rPr>
+        <w:t xml:space="preserve"> </w:t>
+      </w:r>
+      <w:r>
+        <w:rPr>
+          <w:b/>
+          <w:color w:val="000000" w:themeColor="text1"/>
+          <w:sz w:val="20"/>
+          <w:szCs w:val="20"/>
+        </w:rPr>
+        <w:t>({{</w:t>
       </w:r>
       <w:proofErr w:type="spellStart"/>
       <w:r>
@@ -1665,7 +1704,7 @@
           <w:sz w:val="20"/>
           <w:szCs w:val="20"/>
         </w:rPr>
-        <w:t xml:space="preserve">}} ) meses </w:t>
+        <w:t xml:space="preserve">}}) meses </w:t>
       </w:r>
       <w:r>
         <w:rPr>
@@ -1700,7 +1739,7 @@
           <w:sz w:val="20"/>
           <w:szCs w:val="20"/>
         </w:rPr>
-        <w:t xml:space="preserve"> {{</w:t>
+        <w:t>{{</w:t>
       </w:r>
       <w:proofErr w:type="spellStart"/>
       <w:r>
@@ -1720,7 +1759,7 @@
           <w:sz w:val="20"/>
           <w:szCs w:val="20"/>
         </w:rPr>
-        <w:t xml:space="preserve">}} </w:t>
+        <w:t>}}</w:t>
       </w:r>
       <w:r>
         <w:rPr>
@@ -1766,7 +1805,6 @@
           <w:sz w:val="20"/>
           <w:szCs w:val="20"/>
         </w:rPr>
-        <w:lastRenderedPageBreak/>
         <w:t xml:space="preserve">Por </w:t>
       </w:r>
       <w:r>
@@ -2610,6 +2648,15 @@
               </w:rPr>
               <w:t>{%</w:t>
             </w:r>
+            <w:proofErr w:type="spellStart"/>
+            <w:r>
+              <w:rPr>
+                <w:sz w:val="16"/>
+                <w:szCs w:val="16"/>
+              </w:rPr>
+              <w:t>tr</w:t>
+            </w:r>
+            <w:proofErr w:type="spellEnd"/>
             <w:r>
               <w:rPr>
                 <w:sz w:val="16"/>
@@ -2631,8 +2678,17 @@
                 <w:sz w:val="16"/>
                 <w:szCs w:val="16"/>
               </w:rPr>
-              <w:t xml:space="preserve"> a in asistencias</w:t>
+              <w:t xml:space="preserve"> a </w:t>
             </w:r>
+            <w:proofErr w:type="gramStart"/>
+            <w:r>
+              <w:rPr>
+                <w:sz w:val="16"/>
+                <w:szCs w:val="16"/>
+              </w:rPr>
+              <w:t>in asistencias</w:t>
+            </w:r>
+            <w:proofErr w:type="gramEnd"/>
             <w:r>
               <w:rPr>
                 <w:sz w:val="16"/>
@@ -2760,6 +2816,7 @@
               <w:t xml:space="preserve"> </w:t>
             </w:r>
             <w:proofErr w:type="spellStart"/>
+            <w:proofErr w:type="gramStart"/>
             <w:r>
               <w:rPr>
                 <w:sz w:val="16"/>
@@ -2768,28 +2825,13 @@
               <w:t>loop.first</w:t>
             </w:r>
             <w:proofErr w:type="spellEnd"/>
+            <w:proofErr w:type="gramEnd"/>
             <w:r>
               <w:rPr>
                 <w:sz w:val="16"/>
                 <w:szCs w:val="16"/>
               </w:rPr>
-              <w:t xml:space="preserve"> %}{{</w:t>
-            </w:r>
-            <w:proofErr w:type="spellStart"/>
-            <w:r>
-              <w:rPr>
-                <w:sz w:val="16"/>
-                <w:szCs w:val="16"/>
-              </w:rPr>
-              <w:t>nombre_mayus</w:t>
-            </w:r>
-            <w:proofErr w:type="spellEnd"/>
-            <w:r>
-              <w:rPr>
-                <w:sz w:val="16"/>
-                <w:szCs w:val="16"/>
-              </w:rPr>
-              <w:t xml:space="preserve">}} con C.I. </w:t>
+              <w:t xml:space="preserve"> %}{{nombre_mayus}} con C.I. </w:t>
             </w:r>
             <w:proofErr w:type="spellStart"/>
             <w:r>
@@ -2883,7 +2925,7 @@
               </w:rPr>
               <w:t>{{</w:t>
             </w:r>
-            <w:proofErr w:type="spellStart"/>
+            <w:proofErr w:type="gramStart"/>
             <w:r>
               <w:rPr>
                 <w:rFonts w:eastAsia="MS Mincho"/>
@@ -2893,7 +2935,7 @@
               </w:rPr>
               <w:t>a.fecha</w:t>
             </w:r>
-            <w:proofErr w:type="spellEnd"/>
+            <w:proofErr w:type="gramEnd"/>
             <w:r>
               <w:rPr>
                 <w:rFonts w:eastAsia="MS Mincho"/>
@@ -2933,7 +2975,7 @@
               </w:rPr>
               <w:t>{{</w:t>
             </w:r>
-            <w:proofErr w:type="spellStart"/>
+            <w:proofErr w:type="gramStart"/>
             <w:r>
               <w:rPr>
                 <w:rFonts w:eastAsia="MS Mincho"/>
@@ -2943,7 +2985,7 @@
               </w:rPr>
               <w:t>a.actividad</w:t>
             </w:r>
-            <w:proofErr w:type="spellEnd"/>
+            <w:proofErr w:type="gramEnd"/>
             <w:r>
               <w:rPr>
                 <w:rFonts w:eastAsia="MS Mincho"/>
@@ -2983,7 +3025,7 @@
               </w:rPr>
               <w:t>{{</w:t>
             </w:r>
-            <w:proofErr w:type="spellStart"/>
+            <w:proofErr w:type="gramStart"/>
             <w:r>
               <w:rPr>
                 <w:rFonts w:eastAsia="MS Mincho"/>
@@ -2993,7 +3035,7 @@
               </w:rPr>
               <w:t>a.asistencia</w:t>
             </w:r>
-            <w:proofErr w:type="spellEnd"/>
+            <w:proofErr w:type="gramEnd"/>
             <w:r>
               <w:rPr>
                 <w:rFonts w:eastAsia="MS Mincho"/>
@@ -3035,7 +3077,23 @@
                 <w:sz w:val="16"/>
                 <w:szCs w:val="16"/>
               </w:rPr>
-              <w:t xml:space="preserve">{% </w:t>
+              <w:t>{%</w:t>
+            </w:r>
+            <w:proofErr w:type="spellStart"/>
+            <w:r>
+              <w:rPr>
+                <w:sz w:val="16"/>
+                <w:szCs w:val="16"/>
+              </w:rPr>
+              <w:t>tr</w:t>
+            </w:r>
+            <w:proofErr w:type="spellEnd"/>
+            <w:r>
+              <w:rPr>
+                <w:sz w:val="16"/>
+                <w:szCs w:val="16"/>
+              </w:rPr>
+              <w:t xml:space="preserve"> </w:t>
             </w:r>
             <w:proofErr w:type="spellStart"/>
             <w:r>
@@ -3851,7 +3909,6 @@
           <w:szCs w:val="22"/>
           <w:u w:val="single"/>
         </w:rPr>
-        <w:lastRenderedPageBreak/>
         <w:t>EVALUACIÓN DE DESEMPEÑO DEL TRABAJO COMUNITARIO</w:t>
       </w:r>
     </w:p>
@@ -4275,6 +4332,7 @@
                 <w:szCs w:val="14"/>
               </w:rPr>
             </w:pPr>
+            <w:proofErr w:type="gramStart"/>
             <w:r>
               <w:rPr>
                 <w:rFonts w:eastAsia="MS Mincho" w:cstheme="minorHAnsi"/>
@@ -4284,6 +4342,7 @@
               </w:rPr>
               <w:t>JORNADAS A TRABAJAR</w:t>
             </w:r>
+            <w:proofErr w:type="gramEnd"/>
           </w:p>
         </w:tc>
         <w:tc>
@@ -4393,25 +4452,7 @@
                 <w:sz w:val="16"/>
                 <w:szCs w:val="18"/>
               </w:rPr>
-              <w:t>{{</w:t>
-            </w:r>
-            <w:proofErr w:type="spellStart"/>
-            <w:r>
-              <w:rPr>
-                <w:rFonts w:eastAsia="MS Mincho"/>
-                <w:sz w:val="16"/>
-                <w:szCs w:val="18"/>
-              </w:rPr>
-              <w:t>nombre_mayus</w:t>
-            </w:r>
-            <w:proofErr w:type="spellEnd"/>
-            <w:r>
-              <w:rPr>
-                <w:rFonts w:eastAsia="MS Mincho"/>
-                <w:sz w:val="16"/>
-                <w:szCs w:val="18"/>
-              </w:rPr>
-              <w:t>}}</w:t>
+              <w:t>{{nombre_mayus}}</w:t>
             </w:r>
             <w:r>
               <w:rPr>

</xml_diff>